<commit_message>
Docs: sync SDD, API docs, Style Guide, both READMEs to the 24-item pass
Updates the Status line / "Not Yet Built" lists / Open Items sections
across all four project documents plus both READMEs, which previously
undercounted the real remaining-work list at six items when this
session's own completeness audit found eighteen more IA/wireframe/visual
screens plus the entire USSD/SMS channel had never been enumerated.

Adds SDD Sections 26-27 (the full 24-item build + its responsive QA pass)
and API doc Sections 11-13 (Reporting Dashboard, Control Centre Dashboard,
USSD/SMS Channel endpoints), extends the existing per-role endpoint
tables with every new route, and renumbers Error Format/Not Yet Built
accordingly. All three .docx files validated clean against their
originals; Style Guide's paragraph count is unchanged (in-place text
replacement only).

Co-Authored-By: Claude Sonnet 5 <noreply@anthropic.com>
</commit_message>
<xml_diff>
--- a/Farm_Master_API_Documentation_Stage6.docx
+++ b/Farm_Master_API_Documentation_Stage6.docx
@@ -317,6 +317,216 @@
           </w:p>
         </w:tc>
       </w:tr>
+      <w:tr>
+        <w:tc>
+          <w:tcPr>
+            <w:tcW w:type="dxa" w:w="2448"/>
+          </w:tcPr>
+          <w:p>
+            <w:r>
+              <w:t>GET /buyer/requirements</w:t>
+            </w:r>
+          </w:p>
+        </w:tc>
+        <w:tc>
+          <w:tcPr>
+            <w:tcW w:type="dxa" w:w="2736"/>
+          </w:tcPr>
+          <w:p>
+            <w:r>
+              <w:t>—</w:t>
+            </w:r>
+          </w:p>
+        </w:tc>
+        <w:tc>
+          <w:tcPr>
+            <w:tcW w:type="dxa" w:w="2448"/>
+          </w:tcPr>
+          <w:p>
+            <w:r>
+              <w:t>List of RequirementResponse, newest first</w:t>
+            </w:r>
+          </w:p>
+        </w:tc>
+        <w:tc>
+          <w:tcPr>
+            <w:tcW w:type="dxa" w:w="3744"/>
+          </w:tcPr>
+          <w:p>
+            <w:r>
+              <w:t>The caller’s own requirements -- Buyer Dashboard’s data source.</w:t>
+            </w:r>
+          </w:p>
+        </w:tc>
+      </w:tr>
+      <w:tr>
+        <w:tc>
+          <w:tcPr>
+            <w:tcW w:type="dxa" w:w="2448"/>
+          </w:tcPr>
+          <w:p>
+            <w:r>
+              <w:t>GET /buyer/dashboard</w:t>
+            </w:r>
+          </w:p>
+        </w:tc>
+        <w:tc>
+          <w:tcPr>
+            <w:tcW w:type="dxa" w:w="2736"/>
+          </w:tcPr>
+          <w:p>
+            <w:r>
+              <w:t>—</w:t>
+            </w:r>
+          </w:p>
+        </w:tc>
+        <w:tc>
+          <w:tcPr>
+            <w:tcW w:type="dxa" w:w="2448"/>
+          </w:tcPr>
+          <w:p>
+            <w:r>
+              <w:t>BuyerDashboardResponse</w:t>
+            </w:r>
+          </w:p>
+        </w:tc>
+        <w:tc>
+          <w:tcPr>
+            <w:tcW w:type="dxa" w:w="3744"/>
+          </w:tcPr>
+          <w:p>
+            <w:r>
+              <w:t>Active-order stats + 5 most recent orders. Added 8 Sep 2026.</w:t>
+            </w:r>
+          </w:p>
+        </w:tc>
+      </w:tr>
+      <w:tr>
+        <w:tc>
+          <w:tcPr>
+            <w:tcW w:type="dxa" w:w="2448"/>
+          </w:tcPr>
+          <w:p>
+            <w:r>
+              <w:t>GET /buyer/requirements/{id}/docs</w:t>
+            </w:r>
+          </w:p>
+        </w:tc>
+        <w:tc>
+          <w:tcPr>
+            <w:tcW w:type="dxa" w:w="2736"/>
+          </w:tcPr>
+          <w:p>
+            <w:r>
+              <w:t>—</w:t>
+            </w:r>
+          </w:p>
+        </w:tc>
+        <w:tc>
+          <w:tcPr>
+            <w:tcW w:type="dxa" w:w="2448"/>
+          </w:tcPr>
+          <w:p>
+            <w:r>
+              <w:t>BuyerDocumentsResponse</w:t>
+            </w:r>
+          </w:p>
+        </w:tc>
+        <w:tc>
+          <w:tcPr>
+            <w:tcW w:type="dxa" w:w="3744"/>
+          </w:tcPr>
+          <w:p>
+            <w:r>
+              <w:t>Real FulfilmentIntake grading rows presented as documents, plus a MoFA-export placeholder row. Added 8 Sep 2026.</w:t>
+            </w:r>
+          </w:p>
+        </w:tc>
+      </w:tr>
+      <w:tr>
+        <w:tc>
+          <w:tcPr>
+            <w:tcW w:type="dxa" w:w="2448"/>
+          </w:tcPr>
+          <w:p>
+            <w:r>
+              <w:t>GET /buyer/requirements/{id}/tracking</w:t>
+            </w:r>
+          </w:p>
+        </w:tc>
+        <w:tc>
+          <w:tcPr>
+            <w:tcW w:type="dxa" w:w="2736"/>
+          </w:tcPr>
+          <w:p>
+            <w:r>
+              <w:t>—</w:t>
+            </w:r>
+          </w:p>
+        </w:tc>
+        <w:tc>
+          <w:tcPr>
+            <w:tcW w:type="dxa" w:w="2448"/>
+          </w:tcPr>
+          <w:p>
+            <w:r>
+              <w:t>BuyerTrackingResponse</w:t>
+            </w:r>
+          </w:p>
+        </w:tc>
+        <w:tc>
+          <w:tcPr>
+            <w:tcW w:type="dxa" w:w="3744"/>
+          </w:tcPr>
+          <w:p>
+            <w:r>
+              <w:t>Real delivery log from DispatchJob/FulfilmentIntake for the caller’s own order. Added 8 Sep 2026.</w:t>
+            </w:r>
+          </w:p>
+        </w:tc>
+      </w:tr>
+      <w:tr>
+        <w:tc>
+          <w:tcPr>
+            <w:tcW w:type="dxa" w:w="2448"/>
+          </w:tcPr>
+          <w:p>
+            <w:r>
+              <w:t>GET /buyer/requirements/{id}/invoice</w:t>
+            </w:r>
+          </w:p>
+        </w:tc>
+        <w:tc>
+          <w:tcPr>
+            <w:tcW w:type="dxa" w:w="2736"/>
+          </w:tcPr>
+          <w:p>
+            <w:r>
+              <w:t>—</w:t>
+            </w:r>
+          </w:p>
+        </w:tc>
+        <w:tc>
+          <w:tcPr>
+            <w:tcW w:type="dxa" w:w="2448"/>
+          </w:tcPr>
+          <w:p>
+            <w:r>
+              <w:t>BuyerInvoiceResponse</w:t>
+            </w:r>
+          </w:p>
+        </w:tc>
+        <w:tc>
+          <w:tcPr>
+            <w:tcW w:type="dxa" w:w="3744"/>
+          </w:tcPr>
+          <w:p>
+            <w:r>
+              <w:t>Reuses reconciliation.py’s compute_figures for the buyer’s own net payable. Added 8 Sep 2026.</w:t>
+            </w:r>
+          </w:p>
+        </w:tc>
+      </w:tr>
     </w:tbl>
     <w:p>
       <w:pPr>
@@ -829,6 +1039,174 @@
           </w:p>
         </w:tc>
       </w:tr>
+      <w:tr>
+        <w:tc>
+          <w:tcPr>
+            <w:tcW w:type="dxa" w:w="2448"/>
+          </w:tcPr>
+          <w:p>
+            <w:r>
+              <w:t>GET /farmer/dashboard</w:t>
+            </w:r>
+          </w:p>
+        </w:tc>
+        <w:tc>
+          <w:tcPr>
+            <w:tcW w:type="dxa" w:w="2736"/>
+          </w:tcPr>
+          <w:p>
+            <w:r>
+              <w:t>—</w:t>
+            </w:r>
+          </w:p>
+        </w:tc>
+        <w:tc>
+          <w:tcPr>
+            <w:tcW w:type="dxa" w:w="2448"/>
+          </w:tcPr>
+          <w:p>
+            <w:r>
+              <w:t>FarmerDashboardResponse</w:t>
+            </w:r>
+          </w:p>
+        </w:tc>
+        <w:tc>
+          <w:tcPr>
+            <w:tcW w:type="dxa" w:w="3744"/>
+          </w:tcPr>
+          <w:p>
+            <w:r>
+              <w:t>Open/accepted opportunity counts, pending pickups, unread-message flag. Added 8 Sep 2026.</w:t>
+            </w:r>
+          </w:p>
+        </w:tc>
+      </w:tr>
+      <w:tr>
+        <w:tc>
+          <w:tcPr>
+            <w:tcW w:type="dxa" w:w="2448"/>
+          </w:tcPr>
+          <w:p>
+            <w:r>
+              <w:t>GET/POST /farmer/milestones</w:t>
+            </w:r>
+          </w:p>
+        </w:tc>
+        <w:tc>
+          <w:tcPr>
+            <w:tcW w:type="dxa" w:w="2736"/>
+          </w:tcPr>
+          <w:p>
+            <w:r>
+              <w:t>title, note, opportunity_id (POST)</w:t>
+            </w:r>
+          </w:p>
+        </w:tc>
+        <w:tc>
+          <w:tcPr>
+            <w:tcW w:type="dxa" w:w="2448"/>
+          </w:tcPr>
+          <w:p>
+            <w:r>
+              <w:t>List/one MilestoneLogEntryResponse</w:t>
+            </w:r>
+          </w:p>
+        </w:tc>
+        <w:tc>
+          <w:tcPr>
+            <w:tcW w:type="dxa" w:w="3744"/>
+          </w:tcPr>
+          <w:p>
+            <w:r>
+              <w:t>Structure-only -- offline-tolerant sync explicitly out of scope. Added 8 Sep 2026.</w:t>
+            </w:r>
+          </w:p>
+        </w:tc>
+      </w:tr>
+      <w:tr>
+        <w:tc>
+          <w:tcPr>
+            <w:tcW w:type="dxa" w:w="2448"/>
+          </w:tcPr>
+          <w:p>
+            <w:r>
+              <w:t>GET/POST /farmer/messages</w:t>
+            </w:r>
+          </w:p>
+        </w:tc>
+        <w:tc>
+          <w:tcPr>
+            <w:tcW w:type="dxa" w:w="2736"/>
+          </w:tcPr>
+          <w:p>
+            <w:r>
+              <w:t>body (POST)</w:t>
+            </w:r>
+          </w:p>
+        </w:tc>
+        <w:tc>
+          <w:tcPr>
+            <w:tcW w:type="dxa" w:w="2448"/>
+          </w:tcPr>
+          <w:p>
+            <w:r>
+              <w:t>List/one AgronomistMessageResponse</w:t>
+            </w:r>
+          </w:p>
+        </w:tc>
+        <w:tc>
+          <w:tcPr>
+            <w:tcW w:type="dxa" w:w="3744"/>
+          </w:tcPr>
+          <w:p>
+            <w:r>
+              <w:t>Farmer side of the single shared Agronomy inbox. Added 8 Sep 2026.</w:t>
+            </w:r>
+          </w:p>
+        </w:tc>
+      </w:tr>
+      <w:tr>
+        <w:tc>
+          <w:tcPr>
+            <w:tcW w:type="dxa" w:w="2448"/>
+          </w:tcPr>
+          <w:p>
+            <w:r>
+              <w:t>GET /farmer/wallet</w:t>
+            </w:r>
+          </w:p>
+        </w:tc>
+        <w:tc>
+          <w:tcPr>
+            <w:tcW w:type="dxa" w:w="2736"/>
+          </w:tcPr>
+          <w:p>
+            <w:r>
+              <w:t>—</w:t>
+            </w:r>
+          </w:p>
+        </w:tc>
+        <w:tc>
+          <w:tcPr>
+            <w:tcW w:type="dxa" w:w="2448"/>
+          </w:tcPr>
+          <w:p>
+            <w:r>
+              <w:t>FarmerWalletResponse</w:t>
+            </w:r>
+          </w:p>
+        </w:tc>
+        <w:tc>
+          <w:tcPr>
+            <w:tcW w:type="dxa" w:w="3744"/>
+          </w:tcPr>
+          <w:p>
+            <w:r>
+              <w:t>The caller’s own delivered tonnage and settlement, order by order -- see wallet.py. Added 8 Sep 2026.</w:t>
+            </w:r>
+          </w:p>
+        </w:tc>
+      </w:tr>
     </w:tbl>
     <w:p>
       <w:pPr>
@@ -1373,6 +1751,216 @@
           <w:p>
             <w:r>
               <w:t>409 if not PENDING. Restores every line’s reserved stock_qty.</w:t>
+            </w:r>
+          </w:p>
+        </w:tc>
+      </w:tr>
+      <w:tr>
+        <w:tc>
+          <w:tcPr>
+            <w:tcW w:type="dxa" w:w="2448"/>
+          </w:tcPr>
+          <w:p>
+            <w:r>
+              <w:t>GET /vendor/dashboard</w:t>
+            </w:r>
+          </w:p>
+        </w:tc>
+        <w:tc>
+          <w:tcPr>
+            <w:tcW w:type="dxa" w:w="2736"/>
+          </w:tcPr>
+          <w:p>
+            <w:r>
+              <w:t>—</w:t>
+            </w:r>
+          </w:p>
+        </w:tc>
+        <w:tc>
+          <w:tcPr>
+            <w:tcW w:type="dxa" w:w="2448"/>
+          </w:tcPr>
+          <w:p>
+            <w:r>
+              <w:t>VendorDashboardResponse</w:t>
+            </w:r>
+          </w:p>
+        </w:tc>
+        <w:tc>
+          <w:tcPr>
+            <w:tcW w:type="dxa" w:w="3744"/>
+          </w:tcPr>
+          <w:p>
+            <w:r>
+              <w:t>Pending requests/orders, catalogue size and low-stock count. Added 8 Sep 2026.</w:t>
+            </w:r>
+          </w:p>
+        </w:tc>
+      </w:tr>
+      <w:tr>
+        <w:tc>
+          <w:tcPr>
+            <w:tcW w:type="dxa" w:w="2448"/>
+          </w:tcPr>
+          <w:p>
+            <w:r>
+              <w:t>GET /vendor/billing</w:t>
+            </w:r>
+          </w:p>
+        </w:tc>
+        <w:tc>
+          <w:tcPr>
+            <w:tcW w:type="dxa" w:w="2736"/>
+          </w:tcPr>
+          <w:p>
+            <w:r>
+              <w:t>—</w:t>
+            </w:r>
+          </w:p>
+        </w:tc>
+        <w:tc>
+          <w:tcPr>
+            <w:tcW w:type="dxa" w:w="2448"/>
+          </w:tcPr>
+          <w:p>
+            <w:r>
+              <w:t>VendorBillingResponse</w:t>
+            </w:r>
+          </w:p>
+        </w:tc>
+        <w:tc>
+          <w:tcPr>
+            <w:tcW w:type="dxa" w:w="3744"/>
+          </w:tcPr>
+          <w:p>
+            <w:r>
+              <w:t>Subscription plan/status + payment history. Lazily creates the row on first read. Added 8 Sep 2026.</w:t>
+            </w:r>
+          </w:p>
+        </w:tc>
+      </w:tr>
+      <w:tr>
+        <w:tc>
+          <w:tcPr>
+            <w:tcW w:type="dxa" w:w="2448"/>
+          </w:tcPr>
+          <w:p>
+            <w:r>
+              <w:t>POST /vendor/billing/pay</w:t>
+            </w:r>
+          </w:p>
+        </w:tc>
+        <w:tc>
+          <w:tcPr>
+            <w:tcW w:type="dxa" w:w="2736"/>
+          </w:tcPr>
+          <w:p>
+            <w:r>
+              <w:t>method: momo | vodafone | airteltigo | card</w:t>
+            </w:r>
+          </w:p>
+        </w:tc>
+        <w:tc>
+          <w:tcPr>
+            <w:tcW w:type="dxa" w:w="2448"/>
+          </w:tcPr>
+          <w:p>
+            <w:r>
+              <w:t>VendorBillingResponse</w:t>
+            </w:r>
+          </w:p>
+        </w:tc>
+        <w:tc>
+          <w:tcPr>
+            <w:tcW w:type="dxa" w:w="3744"/>
+          </w:tcPr>
+          <w:p>
+            <w:r>
+              <w:t>501 for card (Paystack/Hubtel TBD) -- same treatment as the Buyer commitment fee. Writes vendor_subscription_paid audit entry. Added 8 Sep 2026.</w:t>
+            </w:r>
+          </w:p>
+        </w:tc>
+      </w:tr>
+      <w:tr>
+        <w:tc>
+          <w:tcPr>
+            <w:tcW w:type="dxa" w:w="2448"/>
+          </w:tcPr>
+          <w:p>
+            <w:r>
+              <w:t>GET /vendor/payout</w:t>
+            </w:r>
+          </w:p>
+        </w:tc>
+        <w:tc>
+          <w:tcPr>
+            <w:tcW w:type="dxa" w:w="2736"/>
+          </w:tcPr>
+          <w:p>
+            <w:r>
+              <w:t>—</w:t>
+            </w:r>
+          </w:p>
+        </w:tc>
+        <w:tc>
+          <w:tcPr>
+            <w:tcW w:type="dxa" w:w="2448"/>
+          </w:tcPr>
+          <w:p>
+            <w:r>
+              <w:t>List of VendorPayoutRow</w:t>
+            </w:r>
+          </w:p>
+        </w:tc>
+        <w:tc>
+          <w:tcPr>
+            <w:tcW w:type="dxa" w:w="3744"/>
+          </w:tcPr>
+          <w:p>
+            <w:r>
+              <w:t>Read-only -- see payout.py. Release stays a Finance-only action. Added 8 Sep 2026.</w:t>
+            </w:r>
+          </w:p>
+        </w:tc>
+      </w:tr>
+      <w:tr>
+        <w:tc>
+          <w:tcPr>
+            <w:tcW w:type="dxa" w:w="2448"/>
+          </w:tcPr>
+          <w:p>
+            <w:r>
+              <w:t>GET /vendor/handoff</w:t>
+            </w:r>
+          </w:p>
+        </w:tc>
+        <w:tc>
+          <w:tcPr>
+            <w:tcW w:type="dxa" w:w="2736"/>
+          </w:tcPr>
+          <w:p>
+            <w:r>
+              <w:t>—</w:t>
+            </w:r>
+          </w:p>
+        </w:tc>
+        <w:tc>
+          <w:tcPr>
+            <w:tcW w:type="dxa" w:w="2448"/>
+          </w:tcPr>
+          <w:p>
+            <w:r>
+              <w:t>List of VendorHandoffRow</w:t>
+            </w:r>
+          </w:p>
+        </w:tc>
+        <w:tc>
+          <w:tcPr>
+            <w:tcW w:type="dxa" w:w="3744"/>
+          </w:tcPr>
+          <w:p>
+            <w:r>
+              <w:t>Vendor-sourced DispatchJobs (mechanisation + input order) with proof-captured status. Added 8 Sep 2026.</w:t>
             </w:r>
           </w:p>
         </w:tc>
@@ -1973,6 +2561,48 @@
           </w:p>
         </w:tc>
       </w:tr>
+      <w:tr>
+        <w:tc>
+          <w:tcPr>
+            <w:tcW w:type="dxa" w:w="2448"/>
+          </w:tcPr>
+          <w:p>
+            <w:r>
+              <w:t>GET /admin/audit-log</w:t>
+            </w:r>
+          </w:p>
+        </w:tc>
+        <w:tc>
+          <w:tcPr>
+            <w:tcW w:type="dxa" w:w="2736"/>
+          </w:tcPr>
+          <w:p>
+            <w:r>
+              <w:t>—</w:t>
+            </w:r>
+          </w:p>
+        </w:tc>
+        <w:tc>
+          <w:tcPr>
+            <w:tcW w:type="dxa" w:w="2448"/>
+          </w:tcPr>
+          <w:p>
+            <w:r>
+              <w:t>List of AuditLogEntry</w:t>
+            </w:r>
+          </w:p>
+        </w:tc>
+        <w:tc>
+          <w:tcPr>
+            <w:tcW w:type="dxa" w:w="3744"/>
+          </w:tcPr>
+          <w:p>
+            <w:r>
+              <w:t>Unchanged endpoint (3 Sep 2026) -- now has its first real browsing UI (approvals_flow_live.html), added 8 Sep 2026.</w:t>
+            </w:r>
+          </w:p>
+        </w:tc>
+      </w:tr>
     </w:tbl>
     <w:p>
       <w:pPr>
@@ -2308,6 +2938,174 @@
           <w:p>
             <w:r>
               <w:t>409 if no plan saved yet, or already published. Writes a formula_published audit entry. Does not advance the requirement’s status (SDD Section 13).</w:t>
+            </w:r>
+          </w:p>
+        </w:tc>
+      </w:tr>
+      <w:tr>
+        <w:tc>
+          <w:tcPr>
+            <w:tcW w:type="dxa" w:w="2448"/>
+          </w:tcPr>
+          <w:p>
+            <w:r>
+              <w:t>GET/POST /agronomist/visit-logs</w:t>
+            </w:r>
+          </w:p>
+        </w:tc>
+        <w:tc>
+          <w:tcPr>
+            <w:tcW w:type="dxa" w:w="2736"/>
+          </w:tcPr>
+          <w:p>
+            <w:r>
+              <w:t>farmer_id, checkpoint_label, scheduled_date, opportunity_id, notes (POST)</w:t>
+            </w:r>
+          </w:p>
+        </w:tc>
+        <w:tc>
+          <w:tcPr>
+            <w:tcW w:type="dxa" w:w="2448"/>
+          </w:tcPr>
+          <w:p>
+            <w:r>
+              <w:t>List/one FieldVisitLogResponse</w:t>
+            </w:r>
+          </w:p>
+        </w:tc>
+        <w:tc>
+          <w:tcPr>
+            <w:tcW w:type="dxa" w:w="3744"/>
+          </w:tcPr>
+          <w:p>
+            <w:r>
+              <w:t>Field Visit Logs -- Section 26, SDD. Added 8 Sep 2026.</w:t>
+            </w:r>
+          </w:p>
+        </w:tc>
+      </w:tr>
+      <w:tr>
+        <w:tc>
+          <w:tcPr>
+            <w:tcW w:type="dxa" w:w="2448"/>
+          </w:tcPr>
+          <w:p>
+            <w:r>
+              <w:t>POST /agronomist/visit-logs/{id}/complete</w:t>
+            </w:r>
+          </w:p>
+        </w:tc>
+        <w:tc>
+          <w:tcPr>
+            <w:tcW w:type="dxa" w:w="2736"/>
+          </w:tcPr>
+          <w:p>
+            <w:r>
+              <w:t>notes (optional)</w:t>
+            </w:r>
+          </w:p>
+        </w:tc>
+        <w:tc>
+          <w:tcPr>
+            <w:tcW w:type="dxa" w:w="2448"/>
+          </w:tcPr>
+          <w:p>
+            <w:r>
+              <w:t>FieldVisitLogResponse</w:t>
+            </w:r>
+          </w:p>
+        </w:tc>
+        <w:tc>
+          <w:tcPr>
+            <w:tcW w:type="dxa" w:w="3744"/>
+          </w:tcPr>
+          <w:p>
+            <w:r>
+              <w:t>409 if already completed. Added 8 Sep 2026.</w:t>
+            </w:r>
+          </w:p>
+        </w:tc>
+      </w:tr>
+      <w:tr>
+        <w:tc>
+          <w:tcPr>
+            <w:tcW w:type="dxa" w:w="2448"/>
+          </w:tcPr>
+          <w:p>
+            <w:r>
+              <w:t>GET /agronomist/messages</w:t>
+            </w:r>
+          </w:p>
+        </w:tc>
+        <w:tc>
+          <w:tcPr>
+            <w:tcW w:type="dxa" w:w="2736"/>
+          </w:tcPr>
+          <w:p>
+            <w:r>
+              <w:t>—</w:t>
+            </w:r>
+          </w:p>
+        </w:tc>
+        <w:tc>
+          <w:tcPr>
+            <w:tcW w:type="dxa" w:w="2448"/>
+          </w:tcPr>
+          <w:p>
+            <w:r>
+              <w:t>List of AgronomistMessageResponse</w:t>
+            </w:r>
+          </w:p>
+        </w:tc>
+        <w:tc>
+          <w:tcPr>
+            <w:tcW w:type="dxa" w:w="3744"/>
+          </w:tcPr>
+          <w:p>
+            <w:r>
+              <w:t>The whole shared Agronomy inbox (agronomist side). Added 8 Sep 2026.</w:t>
+            </w:r>
+          </w:p>
+        </w:tc>
+      </w:tr>
+      <w:tr>
+        <w:tc>
+          <w:tcPr>
+            <w:tcW w:type="dxa" w:w="2448"/>
+          </w:tcPr>
+          <w:p>
+            <w:r>
+              <w:t>POST /agronomist/messages/{farmer_id}/reply</w:t>
+            </w:r>
+          </w:p>
+        </w:tc>
+        <w:tc>
+          <w:tcPr>
+            <w:tcW w:type="dxa" w:w="2736"/>
+          </w:tcPr>
+          <w:p>
+            <w:r>
+              <w:t>body</w:t>
+            </w:r>
+          </w:p>
+        </w:tc>
+        <w:tc>
+          <w:tcPr>
+            <w:tcW w:type="dxa" w:w="2448"/>
+          </w:tcPr>
+          <w:p>
+            <w:r>
+              <w:t>AgronomistMessageResponse</w:t>
+            </w:r>
+          </w:p>
+        </w:tc>
+        <w:tc>
+          <w:tcPr>
+            <w:tcW w:type="dxa" w:w="3744"/>
+          </w:tcPr>
+          <w:p>
+            <w:r>
+              <w:t>Added 8 Sep 2026.</w:t>
             </w:r>
           </w:p>
         </w:tc>
@@ -2529,6 +3327,216 @@
           </w:p>
         </w:tc>
       </w:tr>
+      <w:tr>
+        <w:tc>
+          <w:tcPr>
+            <w:tcW w:type="dxa" w:w="2448"/>
+          </w:tcPr>
+          <w:p>
+            <w:r>
+              <w:t>GET/POST /logistics/jobs/{id}/proof</w:t>
+            </w:r>
+          </w:p>
+        </w:tc>
+        <w:tc>
+          <w:tcPr>
+            <w:tcW w:type="dxa" w:w="2736"/>
+          </w:tcPr>
+          <w:p>
+            <w:r>
+              <w:t>gps_lat, gps_lng, signature_captured, photo_captured (POST)</w:t>
+            </w:r>
+          </w:p>
+        </w:tc>
+        <w:tc>
+          <w:tcPr>
+            <w:tcW w:type="dxa" w:w="2448"/>
+          </w:tcPr>
+          <w:p>
+            <w:r>
+              <w:t>ProofOfDeliveryResponse</w:t>
+            </w:r>
+          </w:p>
+        </w:tc>
+        <w:tc>
+          <w:tcPr>
+            <w:tcW w:type="dxa" w:w="3744"/>
+          </w:tcPr>
+          <w:p>
+            <w:r>
+              <w:t>409 if the job isn’t DELIVERED yet, or if proof already exists. GPS via the browser’s real Geolocation API, manual fallback. Added 8 Sep 2026.</w:t>
+            </w:r>
+          </w:p>
+        </w:tc>
+      </w:tr>
+      <w:tr>
+        <w:tc>
+          <w:tcPr>
+            <w:tcW w:type="dxa" w:w="2448"/>
+          </w:tcPr>
+          <w:p>
+            <w:r>
+              <w:t>GET /logistics/trunking/availability</w:t>
+            </w:r>
+          </w:p>
+        </w:tc>
+        <w:tc>
+          <w:tcPr>
+            <w:tcW w:type="dxa" w:w="2736"/>
+          </w:tcPr>
+          <w:p>
+            <w:r>
+              <w:t>—</w:t>
+            </w:r>
+          </w:p>
+        </w:tc>
+        <w:tc>
+          <w:tcPr>
+            <w:tcW w:type="dxa" w:w="2448"/>
+          </w:tcPr>
+          <w:p>
+            <w:r>
+              <w:t>TrunkingAvailabilityResponse</w:t>
+            </w:r>
+          </w:p>
+        </w:tc>
+        <w:tc>
+          <w:tcPr>
+            <w:tcW w:type="dxa" w:w="3744"/>
+          </w:tcPr>
+          <w:p>
+            <w:r>
+              <w:t>Real graded, non-REJECT tonnage not yet claimed by a TrunkingJob. Added 8 Sep 2026.</w:t>
+            </w:r>
+          </w:p>
+        </w:tc>
+      </w:tr>
+      <w:tr>
+        <w:tc>
+          <w:tcPr>
+            <w:tcW w:type="dxa" w:w="2448"/>
+          </w:tcPr>
+          <w:p>
+            <w:r>
+              <w:t>GET/POST /logistics/trunking</w:t>
+            </w:r>
+          </w:p>
+        </w:tc>
+        <w:tc>
+          <w:tcPr>
+            <w:tcW w:type="dxa" w:w="2736"/>
+          </w:tcPr>
+          <w:p>
+            <w:r>
+              <w:t>produce_tonnes, destination, vehicle_label (POST)</w:t>
+            </w:r>
+          </w:p>
+        </w:tc>
+        <w:tc>
+          <w:tcPr>
+            <w:tcW w:type="dxa" w:w="2448"/>
+          </w:tcPr>
+          <w:p>
+            <w:r>
+              <w:t>List/one TrunkingJobResponse</w:t>
+            </w:r>
+          </w:p>
+        </w:tc>
+        <w:tc>
+          <w:tcPr>
+            <w:tcW w:type="dxa" w:w="3744"/>
+          </w:tcPr>
+          <w:p>
+            <w:r>
+              <w:t>409 if produce_tonnes exceeds real availability. Added 8 Sep 2026.</w:t>
+            </w:r>
+          </w:p>
+        </w:tc>
+      </w:tr>
+      <w:tr>
+        <w:tc>
+          <w:tcPr>
+            <w:tcW w:type="dxa" w:w="2448"/>
+          </w:tcPr>
+          <w:p>
+            <w:r>
+              <w:t>POST /logistics/trunking/{id}/dispatch</w:t>
+            </w:r>
+          </w:p>
+        </w:tc>
+        <w:tc>
+          <w:tcPr>
+            <w:tcW w:type="dxa" w:w="2736"/>
+          </w:tcPr>
+          <w:p>
+            <w:r>
+              <w:t>—</w:t>
+            </w:r>
+          </w:p>
+        </w:tc>
+        <w:tc>
+          <w:tcPr>
+            <w:tcW w:type="dxa" w:w="2448"/>
+          </w:tcPr>
+          <w:p>
+            <w:r>
+              <w:t>TrunkingJobResponse</w:t>
+            </w:r>
+          </w:p>
+        </w:tc>
+        <w:tc>
+          <w:tcPr>
+            <w:tcW w:type="dxa" w:w="3744"/>
+          </w:tcPr>
+          <w:p>
+            <w:r>
+              <w:t>409 unless SCHEDULED. Added 8 Sep 2026.</w:t>
+            </w:r>
+          </w:p>
+        </w:tc>
+      </w:tr>
+      <w:tr>
+        <w:tc>
+          <w:tcPr>
+            <w:tcW w:type="dxa" w:w="2448"/>
+          </w:tcPr>
+          <w:p>
+            <w:r>
+              <w:t>POST /logistics/trunking/{id}/deliver</w:t>
+            </w:r>
+          </w:p>
+        </w:tc>
+        <w:tc>
+          <w:tcPr>
+            <w:tcW w:type="dxa" w:w="2736"/>
+          </w:tcPr>
+          <w:p>
+            <w:r>
+              <w:t>—</w:t>
+            </w:r>
+          </w:p>
+        </w:tc>
+        <w:tc>
+          <w:tcPr>
+            <w:tcW w:type="dxa" w:w="2448"/>
+          </w:tcPr>
+          <w:p>
+            <w:r>
+              <w:t>TrunkingJobResponse</w:t>
+            </w:r>
+          </w:p>
+        </w:tc>
+        <w:tc>
+          <w:tcPr>
+            <w:tcW w:type="dxa" w:w="3744"/>
+          </w:tcPr>
+          <w:p>
+            <w:r>
+              <w:t>409 unless DISPATCHED. Added 8 Sep 2026.</w:t>
+            </w:r>
+          </w:p>
+        </w:tc>
+      </w:tr>
     </w:tbl>
     <w:p>
       <w:pPr>
@@ -2963,6 +3971,48 @@
           </w:p>
         </w:tc>
       </w:tr>
+      <w:tr>
+        <w:tc>
+          <w:tcPr>
+            <w:tcW w:type="dxa" w:w="2448"/>
+          </w:tcPr>
+          <w:p>
+            <w:r>
+              <w:t>GET /reporting/dashboard</w:t>
+            </w:r>
+          </w:p>
+        </w:tc>
+        <w:tc>
+          <w:tcPr>
+            <w:tcW w:type="dxa" w:w="2736"/>
+          </w:tcPr>
+          <w:p>
+            <w:r>
+              <w:t>—</w:t>
+            </w:r>
+          </w:p>
+        </w:tc>
+        <w:tc>
+          <w:tcPr>
+            <w:tcW w:type="dxa" w:w="2448"/>
+          </w:tcPr>
+          <w:p>
+            <w:r>
+              <w:t>ReportingDashboardResponse</w:t>
+            </w:r>
+          </w:p>
+        </w:tc>
+        <w:tc>
+          <w:tcPr>
+            <w:tcW w:type="dxa" w:w="3744"/>
+          </w:tcPr>
+          <w:p>
+            <w:r>
+              <w:t>PRD Section 7’s six revenue streams (three live, three deferred-phase) + pilot metrics. Added 8 Sep 2026 -- see Section 11 below.</w:t>
+            </w:r>
+          </w:p>
+        </w:tc>
+      </w:tr>
     </w:tbl>
     <w:p>
       <w:pPr>
@@ -3180,13 +4230,571 @@
           </w:p>
         </w:tc>
       </w:tr>
+      <w:tr>
+        <w:tc>
+          <w:tcPr>
+            <w:tcW w:type="dxa" w:w="2448"/>
+          </w:tcPr>
+          <w:p>
+            <w:r>
+              <w:t>GET/POST /mofa/import-records</w:t>
+            </w:r>
+          </w:p>
+        </w:tc>
+        <w:tc>
+          <w:tcPr>
+            <w:tcW w:type="dxa" w:w="2736"/>
+          </w:tcPr>
+          <w:p>
+            <w:r>
+              <w:t>buyer_name, verified (POST)</w:t>
+            </w:r>
+          </w:p>
+        </w:tc>
+        <w:tc>
+          <w:tcPr>
+            <w:tcW w:type="dxa" w:w="2448"/>
+          </w:tcPr>
+          <w:p>
+            <w:r>
+              <w:t>List/one MofaImportRecordResponse</w:t>
+            </w:r>
+          </w:p>
+        </w:tc>
+        <w:tc>
+          <w:tcPr>
+            <w:tcW w:type="dxa" w:w="3744"/>
+          </w:tcPr>
+          <w:p>
+            <w:r>
+              <w:t>The wireframe’s "Manual import (no live API yet)" panel -- a real record, not a stub. Added 8 Sep 2026.</w:t>
+            </w:r>
+          </w:p>
+        </w:tc>
+      </w:tr>
     </w:tbl>
     <w:p>
       <w:pPr>
         <w:pStyle w:val="Heading1"/>
       </w:pPr>
       <w:r>
-        <w:t>11. Error Format</w:t>
+        <w:t>11. Reporting Dashboard Endpoints (role: finance)</w:t>
+      </w:r>
+    </w:p>
+    <w:p>
+      <w:r>
+        <w:t>Added 8 Sep 2026, closing a gap this session’s own completeness audit surfaced. Distinct from Section 10’s MoFA Compliance Report (an external/buyer-facing export) -- this is Farm Master’s own internal Phase 1 success-metrics dashboard (PRD Section 7).</w:t>
+      </w:r>
+    </w:p>
+    <w:tbl>
+      <w:tblPr>
+        <w:tblW w:type="auto" w:w="0"/>
+        <w:tblLayout w:type="fixed"/>
+        <w:tblLook w:firstColumn="1" w:firstRow="1" w:lastColumn="0" w:lastRow="0" w:noHBand="0" w:noVBand="1" w:val="04A0"/>
+        <w:tblBorders>
+          <w:top w:val="single" w:color="auto" w:sz="4"/>
+          <w:left w:val="single" w:color="auto" w:sz="4"/>
+          <w:bottom w:val="single" w:color="auto" w:sz="4"/>
+          <w:right w:val="single" w:color="auto" w:sz="4"/>
+          <w:insideH w:val="single" w:color="auto" w:sz="4"/>
+          <w:insideV w:val="single" w:color="auto" w:sz="4"/>
+        </w:tblBorders>
+      </w:tblPr>
+      <w:tblGrid>
+        <w:gridCol w:w="2160"/>
+        <w:gridCol w:w="2160"/>
+        <w:gridCol w:w="2160"/>
+        <w:gridCol w:w="2160"/>
+      </w:tblGrid>
+      <w:tr>
+        <w:tc>
+          <w:tcPr>
+            <w:tcW w:type="dxa" w:w="2448"/>
+          </w:tcPr>
+          <w:p>
+            <w:r>
+              <w:rPr>
+                <w:b/>
+              </w:rPr>
+              <w:t>Method &amp; path</w:t>
+            </w:r>
+          </w:p>
+        </w:tc>
+        <w:tc>
+          <w:tcPr>
+            <w:tcW w:type="dxa" w:w="2736"/>
+          </w:tcPr>
+          <w:p>
+            <w:r>
+              <w:rPr>
+                <w:b/>
+              </w:rPr>
+              <w:t>Request body</w:t>
+            </w:r>
+          </w:p>
+        </w:tc>
+        <w:tc>
+          <w:tcPr>
+            <w:tcW w:type="dxa" w:w="2448"/>
+          </w:tcPr>
+          <w:p>
+            <w:r>
+              <w:rPr>
+                <w:b/>
+              </w:rPr>
+              <w:t>Response</w:t>
+            </w:r>
+          </w:p>
+        </w:tc>
+        <w:tc>
+          <w:tcPr>
+            <w:tcW w:type="dxa" w:w="3744"/>
+          </w:tcPr>
+          <w:p>
+            <w:r>
+              <w:rPr>
+                <w:b/>
+              </w:rPr>
+              <w:t>Notes</w:t>
+            </w:r>
+          </w:p>
+        </w:tc>
+      </w:tr>
+      <w:tr>
+        <w:tc>
+          <w:tcPr>
+            <w:tcW w:type="dxa" w:w="2448"/>
+          </w:tcPr>
+          <w:p>
+            <w:r>
+              <w:t>GET /reporting/dashboard</w:t>
+            </w:r>
+          </w:p>
+        </w:tc>
+        <w:tc>
+          <w:tcPr>
+            <w:tcW w:type="dxa" w:w="2736"/>
+          </w:tcPr>
+          <w:p>
+            <w:r>
+              <w:t>—</w:t>
+            </w:r>
+          </w:p>
+        </w:tc>
+        <w:tc>
+          <w:tcPr>
+            <w:tcW w:type="dxa" w:w="2448"/>
+          </w:tcPr>
+          <w:p>
+            <w:r>
+              <w:t>ReportingDashboardResponse: {revenue_streams: [...], registered_farmers, active_buyers, volume_aggregated_tonnes, spec_compliance_rate_pct}</w:t>
+            </w:r>
+          </w:p>
+        </w:tc>
+        <w:tc>
+          <w:tcPr>
+            <w:tcW w:type="dxa" w:w="3744"/>
+          </w:tcPr>
+          <w:p>
+            <w:r>
+              <w:t>revenue_streams has 6 entries -- 3 live (value set), 3 deferred (deferred_phase set, value null). Never fabricates a number for a deferred stream.</w:t>
+            </w:r>
+          </w:p>
+        </w:tc>
+      </w:tr>
+    </w:tbl>
+    <w:p>
+      <w:pPr>
+        <w:pStyle w:val="Heading1"/>
+      </w:pPr>
+      <w:r>
+        <w:t>12. Control Centre Dashboard Endpoints (roles: agronomist, logistics, finance, super_admin)</w:t>
+      </w:r>
+    </w:p>
+    <w:p>
+      <w:r>
+        <w:t>Added 8 Sep 2026, same audit. One shared entry point for all four internal roles (Stage 3 wireframe: "one shared entry point, but the tiles that render depend on the logged-in role").</w:t>
+      </w:r>
+    </w:p>
+    <w:tbl>
+      <w:tblPr>
+        <w:tblW w:type="auto" w:w="0"/>
+        <w:tblLayout w:type="fixed"/>
+        <w:tblLook w:firstColumn="1" w:firstRow="1" w:lastColumn="0" w:lastRow="0" w:noHBand="0" w:noVBand="1" w:val="04A0"/>
+        <w:tblBorders>
+          <w:top w:val="single" w:color="auto" w:sz="4"/>
+          <w:left w:val="single" w:color="auto" w:sz="4"/>
+          <w:bottom w:val="single" w:color="auto" w:sz="4"/>
+          <w:right w:val="single" w:color="auto" w:sz="4"/>
+          <w:insideH w:val="single" w:color="auto" w:sz="4"/>
+          <w:insideV w:val="single" w:color="auto" w:sz="4"/>
+        </w:tblBorders>
+      </w:tblPr>
+      <w:tblGrid>
+        <w:gridCol w:w="2160"/>
+        <w:gridCol w:w="2160"/>
+        <w:gridCol w:w="2160"/>
+        <w:gridCol w:w="2160"/>
+      </w:tblGrid>
+      <w:tr>
+        <w:tc>
+          <w:tcPr>
+            <w:tcW w:type="dxa" w:w="2448"/>
+          </w:tcPr>
+          <w:p>
+            <w:r>
+              <w:rPr>
+                <w:b/>
+              </w:rPr>
+              <w:t>Method &amp; path</w:t>
+            </w:r>
+          </w:p>
+        </w:tc>
+        <w:tc>
+          <w:tcPr>
+            <w:tcW w:type="dxa" w:w="2736"/>
+          </w:tcPr>
+          <w:p>
+            <w:r>
+              <w:rPr>
+                <w:b/>
+              </w:rPr>
+              <w:t>Request body</w:t>
+            </w:r>
+          </w:p>
+        </w:tc>
+        <w:tc>
+          <w:tcPr>
+            <w:tcW w:type="dxa" w:w="2448"/>
+          </w:tcPr>
+          <w:p>
+            <w:r>
+              <w:rPr>
+                <w:b/>
+              </w:rPr>
+              <w:t>Response</w:t>
+            </w:r>
+          </w:p>
+        </w:tc>
+        <w:tc>
+          <w:tcPr>
+            <w:tcW w:type="dxa" w:w="3744"/>
+          </w:tcPr>
+          <w:p>
+            <w:r>
+              <w:rPr>
+                <w:b/>
+              </w:rPr>
+              <w:t>Notes</w:t>
+            </w:r>
+          </w:p>
+        </w:tc>
+      </w:tr>
+      <w:tr>
+        <w:tc>
+          <w:tcPr>
+            <w:tcW w:type="dxa" w:w="2448"/>
+          </w:tcPr>
+          <w:p>
+            <w:r>
+              <w:t>GET /dashboard/control-centre</w:t>
+            </w:r>
+          </w:p>
+        </w:tc>
+        <w:tc>
+          <w:tcPr>
+            <w:tcW w:type="dxa" w:w="2736"/>
+          </w:tcPr>
+          <w:p>
+            <w:r>
+              <w:t>—</w:t>
+            </w:r>
+          </w:p>
+        </w:tc>
+        <w:tc>
+          <w:tcPr>
+            <w:tcW w:type="dxa" w:w="2448"/>
+          </w:tcPr>
+          <w:p>
+            <w:r>
+              <w:t>ControlCentreDashboardResponse: {role, registered_farmers, active_buyers, volume_aggregated_tonnes, tiles: {...}}</w:t>
+            </w:r>
+          </w:p>
+        </w:tc>
+        <w:tc>
+          <w:tcPr>
+            <w:tcW w:type="dxa" w:w="3744"/>
+          </w:tcPr>
+          <w:p>
+            <w:r>
+              <w:t>The season snapshot is identical for every role (non-sensitive, already visible to Finance via Section 11). `tiles` is scoped to the caller’s own role’s domain only -- Finance never sees account-admin counts, Super Admin never sees reconciliation figures.</w:t>
+            </w:r>
+          </w:p>
+        </w:tc>
+      </w:tr>
+    </w:tbl>
+    <w:p>
+      <w:pPr>
+        <w:pStyle w:val="Heading1"/>
+      </w:pPr>
+      <w:r>
+        <w:t>13. USSD/SMS Channel Endpoints (role: farmer)</w:t>
+      </w:r>
+    </w:p>
+    <w:p>
+      <w:r>
+        <w:t>Added 8 Sep 2026, same audit -- the feature-phone fallback (PRD Section 8) had a Stage 3 wireframe but no Stage 4 visual and zero build of any kind before this pass. Reuses the same JWT session as the rest of the app rather than a separate PIN-based auth system -- see SDD Section 26 for why. Every push is logged to UssdSmsLog so delivery is an assertable fact.</w:t>
+      </w:r>
+    </w:p>
+    <w:tbl>
+      <w:tblPr>
+        <w:tblW w:type="auto" w:w="0"/>
+        <w:tblLayout w:type="fixed"/>
+        <w:tblLook w:firstColumn="1" w:firstRow="1" w:lastColumn="0" w:lastRow="0" w:noHBand="0" w:noVBand="1" w:val="04A0"/>
+        <w:tblBorders>
+          <w:top w:val="single" w:color="auto" w:sz="4"/>
+          <w:left w:val="single" w:color="auto" w:sz="4"/>
+          <w:bottom w:val="single" w:color="auto" w:sz="4"/>
+          <w:right w:val="single" w:color="auto" w:sz="4"/>
+          <w:insideH w:val="single" w:color="auto" w:sz="4"/>
+          <w:insideV w:val="single" w:color="auto" w:sz="4"/>
+        </w:tblBorders>
+      </w:tblPr>
+      <w:tblGrid>
+        <w:gridCol w:w="2160"/>
+        <w:gridCol w:w="2160"/>
+        <w:gridCol w:w="2160"/>
+        <w:gridCol w:w="2160"/>
+      </w:tblGrid>
+      <w:tr>
+        <w:tc>
+          <w:tcPr>
+            <w:tcW w:type="dxa" w:w="2448"/>
+          </w:tcPr>
+          <w:p>
+            <w:r>
+              <w:rPr>
+                <w:b/>
+              </w:rPr>
+              <w:t>Method &amp; path</w:t>
+            </w:r>
+          </w:p>
+        </w:tc>
+        <w:tc>
+          <w:tcPr>
+            <w:tcW w:type="dxa" w:w="2736"/>
+          </w:tcPr>
+          <w:p>
+            <w:r>
+              <w:rPr>
+                <w:b/>
+              </w:rPr>
+              <w:t>Request body</w:t>
+            </w:r>
+          </w:p>
+        </w:tc>
+        <w:tc>
+          <w:tcPr>
+            <w:tcW w:type="dxa" w:w="2448"/>
+          </w:tcPr>
+          <w:p>
+            <w:r>
+              <w:rPr>
+                <w:b/>
+              </w:rPr>
+              <w:t>Response</w:t>
+            </w:r>
+          </w:p>
+        </w:tc>
+        <w:tc>
+          <w:tcPr>
+            <w:tcW w:type="dxa" w:w="3744"/>
+          </w:tcPr>
+          <w:p>
+            <w:r>
+              <w:rPr>
+                <w:b/>
+              </w:rPr>
+              <w:t>Notes</w:t>
+            </w:r>
+          </w:p>
+        </w:tc>
+      </w:tr>
+      <w:tr>
+        <w:tc>
+          <w:tcPr>
+            <w:tcW w:type="dxa" w:w="2448"/>
+          </w:tcPr>
+          <w:p>
+            <w:r>
+              <w:t>POST /ussd/opportunities/{id}/push-alert</w:t>
+            </w:r>
+          </w:p>
+        </w:tc>
+        <w:tc>
+          <w:tcPr>
+            <w:tcW w:type="dxa" w:w="2736"/>
+          </w:tcPr>
+          <w:p>
+            <w:r>
+              <w:t>—</w:t>
+            </w:r>
+          </w:p>
+        </w:tc>
+        <w:tc>
+          <w:tcPr>
+            <w:tcW w:type="dxa" w:w="2448"/>
+          </w:tcPr>
+          <w:p>
+            <w:r>
+              <w:t>UssdOpportunityAlert: {opportunity_id, sms_text, ussd_detail_text}</w:t>
+            </w:r>
+          </w:p>
+        </w:tc>
+        <w:tc>
+          <w:tcPr>
+            <w:tcW w:type="dxa" w:w="3744"/>
+          </w:tcPr>
+          <w:p>
+            <w:r>
+              <w:t>PRD Touchpoint 1. 404 if the opportunity is gone/no longer OPEN. Logs an opportunity_alert row.</w:t>
+            </w:r>
+          </w:p>
+        </w:tc>
+      </w:tr>
+      <w:tr>
+        <w:tc>
+          <w:tcPr>
+            <w:tcW w:type="dxa" w:w="2448"/>
+          </w:tcPr>
+          <w:p>
+            <w:r>
+              <w:t>POST /ussd/pickup-confirm</w:t>
+            </w:r>
+          </w:p>
+        </w:tc>
+        <w:tc>
+          <w:tcPr>
+            <w:tcW w:type="dxa" w:w="2736"/>
+          </w:tcPr>
+          <w:p>
+            <w:r>
+              <w:t>quantity_ready_tonnes, preferred_pickup_date, buyer_requirement_id (optional)</w:t>
+            </w:r>
+          </w:p>
+        </w:tc>
+        <w:tc>
+          <w:tcPr>
+            <w:tcW w:type="dxa" w:w="2448"/>
+          </w:tcPr>
+          <w:p>
+            <w:r>
+              <w:t>HarvestPickupRequestResponse</w:t>
+            </w:r>
+          </w:p>
+        </w:tc>
+        <w:tc>
+          <w:tcPr>
+            <w:tcW w:type="dxa" w:w="3744"/>
+          </w:tcPr>
+          <w:p>
+            <w:r>
+              <w:t>PRD Touchpoint 2. Calls farmer.py’s request_harvest_pickup directly -- same validation, same real DispatchJob. Logs a pickup_confirmation row.</w:t>
+            </w:r>
+          </w:p>
+        </w:tc>
+      </w:tr>
+      <w:tr>
+        <w:tc>
+          <w:tcPr>
+            <w:tcW w:type="dxa" w:w="2448"/>
+          </w:tcPr>
+          <w:p>
+            <w:r>
+              <w:t>GET /ussd/payment-notification</w:t>
+            </w:r>
+          </w:p>
+        </w:tc>
+        <w:tc>
+          <w:tcPr>
+            <w:tcW w:type="dxa" w:w="2736"/>
+          </w:tcPr>
+          <w:p>
+            <w:r>
+              <w:t>—</w:t>
+            </w:r>
+          </w:p>
+        </w:tc>
+        <w:tc>
+          <w:tcPr>
+            <w:tcW w:type="dxa" w:w="2448"/>
+          </w:tcPr>
+          <w:p>
+            <w:r>
+              <w:t>UssdPaymentNotification: {sms_text, balance_text}</w:t>
+            </w:r>
+          </w:p>
+        </w:tc>
+        <w:tc>
+          <w:tcPr>
+            <w:tcW w:type="dxa" w:w="3744"/>
+          </w:tcPr>
+          <w:p>
+            <w:r>
+              <w:t>PRD Touchpoint 3. Reuses wallet.py’s compute_farmer_wallet. Logs a payment_notification row.</w:t>
+            </w:r>
+          </w:p>
+        </w:tc>
+      </w:tr>
+      <w:tr>
+        <w:tc>
+          <w:tcPr>
+            <w:tcW w:type="dxa" w:w="2448"/>
+          </w:tcPr>
+          <w:p>
+            <w:r>
+              <w:t>GET /ussd/sms-log</w:t>
+            </w:r>
+          </w:p>
+        </w:tc>
+        <w:tc>
+          <w:tcPr>
+            <w:tcW w:type="dxa" w:w="2736"/>
+          </w:tcPr>
+          <w:p>
+            <w:r>
+              <w:t>—</w:t>
+            </w:r>
+          </w:p>
+        </w:tc>
+        <w:tc>
+          <w:tcPr>
+            <w:tcW w:type="dxa" w:w="2448"/>
+          </w:tcPr>
+          <w:p>
+            <w:r>
+              <w:t>List of UssdSmsLogEntry</w:t>
+            </w:r>
+          </w:p>
+        </w:tc>
+        <w:tc>
+          <w:tcPr>
+            <w:tcW w:type="dxa" w:w="3744"/>
+          </w:tcPr>
+          <w:p>
+            <w:r>
+              <w:t>The caller’s own simulated-SMS history -- what "the farmer was notified" actually asserts against.</w:t>
+            </w:r>
+          </w:p>
+        </w:tc>
+      </w:tr>
+    </w:tbl>
+    <w:p>
+      <w:pPr>
+        <w:pStyle w:val="Heading1"/>
+      </w:pPr>
+      <w:r>
+        <w:t>14. Error Format</w:t>
       </w:r>
     </w:p>
     <w:p>
@@ -3203,7 +4811,7 @@
         <w:pStyle w:val="Heading1"/>
       </w:pPr>
       <w:r>
-        <w:t>12. Not Yet Built</w:t>
+        <w:t>15. Not Yet Built</w:t>
       </w:r>
     </w:p>
     <w:p>
@@ -3212,7 +4820,7 @@
           <w:b w:val="0"/>
           <w:i w:val="0"/>
         </w:rPr>
-        <w:t>The Reporting screen's own revenue-stream/pilot-metrics dashboard (Section 10 covers the MoFA compliance export, a distinct concern); the MoFA import half (a static stub even in the Stage 3 wireframe); a dedicated Registration Approval Queue screen of its own (Stage 4 visual id “approvals” -- Section 5's approve/reject endpoints are real and now have a working UI, but it lives inline on User &amp; Role Admin, Section 5, rather than its own separate screen); feeding a graded intake (Section 8) into Buyer Compliance Docs (Section 9 covers Farmer Wallet/Settlement, Section 10 covers the compliance export -- neither is this); a Buyer-side path for the vendor date-conflict override (Super Admin only, this pass -- see SDD Section 10); catalogue item edit/delete (Section 4); Field Visit Logs, Proof of Pickup/Delivery, and Trunking (Stage 4 visual screens never in Stage 6's Must-Have scope); and any real mobile money or OTP/USSD/MoFA gateway integration -- OTP verification (Section 1) is real end to end but SIMULATED at the delivery layer only.</w:t>
+        <w:t>Only one item remains, confirmed 8 Sep 2026 as a deliberate, unchanged decision (not an oversight): any real mobile money or OTP/USSD/SMS gateway integration -- OTP verification (Section 1) and the USSD/SMS channel (Section 13) are both real end to end but SIMULATED at the delivery layer only. A Buyer-side path for the vendor date-conflict override (Super Admin only, this pass -- see SDD Section 10) and catalogue item edit/delete (Section 4) remain the only other known small gaps, both pre-existing and unrelated to this pass’s scope-closing work. Every screen named in prior versions of this list -- the Reporting dashboard (Section 11), MoFA's import half (Section 10), the Registration Approval Queue's own screen, Field Visit Logs, Proof of Pickup/Delivery, Trunking, all four portal dashboards, Farmer Wallet/Milestone Log/Messaging, Vendor Billing/Payout/Handoff, Buyer Documents/Tracking/Invoice, the Control Centre Dashboard (Section 12), and the Audit Log's browsing UI (Section 5) -- is now real and tested.</w:t>
       </w:r>
     </w:p>
     <w:sectPr>

</xml_diff>

<commit_message>
Docs: sync SDD, API docs, PRD, IA, both READMEs for the OTP/session round
Section 31 (SDD) and Section 1 Authentication (API docs) already document
the email-only OTP consolidation and real session persistence in full;
this adds the matching dated amendments to PRD Section 12 and IA's OTP
screen sections so the historical "both phone and email" narrative stays
intact but is clearly superseded, per the project's documentation
convention of appending dated notes rather than rewriting prior narrative.

Co-Authored-By: Claude Sonnet 5 <noreply@anthropic.com>
</commit_message>
<xml_diff>
--- a/Farm_Master_API_Documentation_Stage6.docx
+++ b/Farm_Master_API_Documentation_Stage6.docx
@@ -70,7 +70,7 @@
           <w:b w:val="0"/>
           <w:i w:val="0"/>
         </w:rPr>
-        <w:t>Real-time OTP verification via phone and email was added 5 September 2026 (PRD Section 12) -- login is now two calls, not one, and self-registration is new. Delivery is SIMULATED: both codes are echoed in the OTP challenge response rather than actually sent (no SMS/email gateway is chosen yet, PRD Section 1.1/12).</w:t>
+        <w:t>Real-time OTP verification via email was added 5 September 2026 (PRD Section 12) -- login is now two calls, not one, and self-registration is new. Consolidated from phone+email to email-only 10 September 2026 for user-friendliness (SDD Section 31) -- dev_only_phone_code and the phone_code request field are gone, not deprecated. Delivery is SIMULATED: the code is echoed in the OTP challenge response rather than actually sent (no email gateway is chosen yet, PRD Section 1.1/12).</w:t>
       </w:r>
     </w:p>
     <w:p>
@@ -79,7 +79,7 @@
           <w:b w:val="0"/>
           <w:i w:val="0"/>
         </w:rPr>
-        <w:t>POST /auth/register — body {email, phone, full_name, password, role, organisation_name (required for buyer/vendor)} — role must be farmer, buyer, or vendor (422 otherwise; Internal Operations roles are Super-Admin-provisioned, not self-registered). 409 if the email is already registered. Returns an OtpChallengeResponse: {challenge_id, purpose: "registration", expires_at, message, dev_only_phone_code, dev_only_email_code}.</w:t>
+        <w:t>POST /auth/register — body {email, phone, full_name, password, role, organisation_name (required for buyer/vendor)} — role must be farmer, buyer, or vendor (422 otherwise; Internal Operations roles are Super-Admin-provisioned, not self-registered). 409 if the email is already registered. Returns an OtpChallengeResponse: {challenge_id, purpose: "registration", expires_at, message, dev_only_email_code}.</w:t>
       </w:r>
     </w:p>
     <w:p>
@@ -88,7 +88,7 @@
           <w:b w:val="0"/>
           <w:i w:val="0"/>
         </w:rPr>
-        <w:t>POST /auth/register/verify-otp — body {challenge_id, phone_code, email_code} — both codes must match. Farmer accounts go straight to status "active". Buyer/Vendor accounts go to "pending_review" and a RegistrationApproval row is created (see Section 5) -- OTP verification is a precondition to entering that existing queue, not a replacement for it. Returns {status, message}.</w:t>
+        <w:t>POST /auth/register/verify-otp — body {challenge_id, email_code}. Farmer accounts go straight to status "active". Buyer/Vendor accounts go to "pending_review" and a RegistrationApproval row is created (see Section 5) -- OTP verification is a precondition to entering that existing queue, not a replacement for it. Returns {status, message}.</w:t>
       </w:r>
     </w:p>
     <w:p>
@@ -106,7 +106,7 @@
           <w:b w:val="0"/>
           <w:i w:val="0"/>
         </w:rPr>
-        <w:t>POST /auth/login/verify-otp — body {challenge_id, phone_code, email_code} — both codes must match and the challenge must be unused and unexpired (401 / 409 / 410 respectively). Returns {access_token, token_type: "bearer", role, full_name} -- the same shape /auth/login used to return directly. Send the token on every subsequent request as header Authorization: Bearer &lt;token&gt;. Tokens expire after 8 hours (dev default, auth.py). There is no refresh-token endpoint yet.</w:t>
+        <w:t>POST /auth/login/verify-otp — body {challenge_id, email_code} — the code must match and the challenge must be unused and unexpired (401 / 409 / 410 respectively). Returns {access_token, token_type: "bearer", role, full_name} -- the same shape /auth/login used to return directly. Send the token on every subsequent request as header Authorization: Bearer &lt;token&gt;. Tokens expire after 8 hours (dev default, auth.py). There is no refresh-token endpoint yet.</w:t>
       </w:r>
     </w:p>
     <w:p>

</xml_diff>

<commit_message>
Document Vendor Product/Service Listing in SDD, API docs, and README
SDD: new Section 32 covering the data model, status lifecycle/re-review
rules, real file upload, admin approval + notifications, the farmer/buyer
browse endpoint's no-caching guarantee, frontend, and known limitations.

API docs: new Sections 17-19 (Vendor Listing endpoints, Admin approval
endpoints, Farmer/Buyer browse endpoints) with full request/response
tables matching the existing endpoint-reference format.

README: a dedicated feature section, two new -flow URLs under "Running
it", a seed-data bullet, and three new "Known limitations" entries
(Super-Admin-only approval scope, in-app-only notifications, local-disk
image storage).

Also adds .claude/launch.json (uvicorn dev-server config used to verify
this feature end-to-end via the in-app Browser preview tooling).

Co-Authored-By: Claude Sonnet 5 <noreply@anthropic.com>
</commit_message>
<xml_diff>
--- a/Farm_Master_API_Documentation_Stage6.docx
+++ b/Farm_Master_API_Documentation_Stage6.docx
@@ -4840,6 +4840,1202 @@
         <w:t>Stage 7 is a testing pass, not a build pass: no endpoints were added, removed, or changed from the contract documented in Sections 1-13. Every endpoint listed in this document is now covered by an automated test asserting its happy path, its documented error responses, and its RBAC boundary -- see Stage 6 Build/tests/api/ and Stage 6 Build/TEST_PLAN.md for the endpoint-by-endpoint mapping. The RBAC matrix (tests/api/test_rbac_matrix.py) systematically re-confirms every GET endpoint's role restrictions against all 7 roles rather than the narrative spot-checks this document has relied on through Stage 6. The Section 15 simulated-delivery boundary (OTP, mobile money, USSD/SMS) is now also enforced by a source scan (tests/api/test_simulated_integrations.py) that fails if any real payment/SMS gateway call, SDK import, or live API URL is ever introduced into auth.py, buyer.py, vendor.py, or ussd.py.</w:t>
       </w:r>
     </w:p>
+    <w:p>
+      <w:pPr>
+        <w:pStyle w:val="Heading1"/>
+      </w:pPr>
+      <w:r>
+        <w:t>17. Vendor Product/Service Listing Endpoints (role: vendor)</w:t>
+      </w:r>
+    </w:p>
+    <w:p>
+      <w:pPr/>
+      <w:r>
+        <w:t>Added 10 Sep 2026 (SDD Section 32) — a separate marketplace listing feature from the Product Catalogue above (Section 4): any good or service a vendor wants farmers/buyers to see, gated by Super Admin approval before it's ever visible. All routes require a vendor JWT and are scoped to the caller's own listings (404 on someone else's). price must be &gt;= 0; quantity_available is optional (nullable, typically omitted for services). Submitting requires all required fields plus at least one image (422 otherwise); a listing never goes straight to active. Editing an active/out_of_stock/rejected listing's core fields resets it to pending_review; the status-toggle endpoint is exempt from this and only accepts active/out_of_stock.</w:t>
+      </w:r>
+    </w:p>
+    <w:tbl>
+      <w:tblPr>
+        <w:tblW w:type="auto" w:w="0"/>
+        <w:tblLook w:firstColumn="1" w:firstRow="1" w:lastColumn="0" w:lastRow="0" w:noHBand="0" w:noVBand="1" w:val="04A0"/>
+        <w:tblBorders>
+          <w:top w:val="single" w:color="auto" w:sz="4"/>
+          <w:left w:val="single" w:color="auto" w:sz="4"/>
+          <w:bottom w:val="single" w:color="auto" w:sz="4"/>
+          <w:right w:val="single" w:color="auto" w:sz="4"/>
+          <w:insideH w:val="single" w:color="auto" w:sz="4"/>
+          <w:insideV w:val="single" w:color="auto" w:sz="4"/>
+        </w:tblBorders>
+      </w:tblPr>
+      <w:tblGrid>
+        <w:gridCol w:w="2160"/>
+        <w:gridCol w:w="2160"/>
+        <w:gridCol w:w="2160"/>
+        <w:gridCol w:w="2160"/>
+      </w:tblGrid>
+      <w:tr>
+        <w:tc>
+          <w:tcPr>
+            <w:tcW w:type="dxa" w:w="2160"/>
+          </w:tcPr>
+          <w:p>
+            <w:r/>
+            <w:r>
+              <w:rPr>
+                <w:b/>
+              </w:rPr>
+              <w:t>Method &amp; path</w:t>
+            </w:r>
+          </w:p>
+        </w:tc>
+        <w:tc>
+          <w:tcPr>
+            <w:tcW w:type="dxa" w:w="2160"/>
+          </w:tcPr>
+          <w:p>
+            <w:r/>
+            <w:r>
+              <w:rPr>
+                <w:b/>
+              </w:rPr>
+              <w:t>Request body</w:t>
+            </w:r>
+          </w:p>
+        </w:tc>
+        <w:tc>
+          <w:tcPr>
+            <w:tcW w:type="dxa" w:w="2160"/>
+          </w:tcPr>
+          <w:p>
+            <w:r/>
+            <w:r>
+              <w:rPr>
+                <w:b/>
+              </w:rPr>
+              <w:t>Response</w:t>
+            </w:r>
+          </w:p>
+        </w:tc>
+        <w:tc>
+          <w:tcPr>
+            <w:tcW w:type="dxa" w:w="2160"/>
+          </w:tcPr>
+          <w:p>
+            <w:r/>
+            <w:r>
+              <w:rPr>
+                <w:b/>
+              </w:rPr>
+              <w:t>Notes</w:t>
+            </w:r>
+          </w:p>
+        </w:tc>
+      </w:tr>
+      <w:tr>
+        <w:tc>
+          <w:tcPr>
+            <w:tcW w:type="dxa" w:w="2160"/>
+          </w:tcPr>
+          <w:p>
+            <w:r/>
+            <w:r>
+              <w:t>GET /vendor/listings</w:t>
+            </w:r>
+          </w:p>
+        </w:tc>
+        <w:tc>
+          <w:tcPr>
+            <w:tcW w:type="dxa" w:w="2160"/>
+          </w:tcPr>
+          <w:p>
+            <w:r/>
+            <w:r>
+              <w:t>— (optional ?status= query filter)</w:t>
+            </w:r>
+          </w:p>
+        </w:tc>
+        <w:tc>
+          <w:tcPr>
+            <w:tcW w:type="dxa" w:w="2160"/>
+          </w:tcPr>
+          <w:p>
+            <w:r/>
+            <w:r>
+              <w:t>List[ListingResponse]</w:t>
+            </w:r>
+          </w:p>
+        </w:tc>
+        <w:tc>
+          <w:tcPr>
+            <w:tcW w:type="dxa" w:w="2160"/>
+          </w:tcPr>
+          <w:p>
+            <w:r/>
+            <w:r>
+              <w:t>Every one of the caller's own listings, newest-updated first.</w:t>
+            </w:r>
+          </w:p>
+        </w:tc>
+      </w:tr>
+      <w:tr>
+        <w:tc>
+          <w:tcPr>
+            <w:tcW w:type="dxa" w:w="2160"/>
+          </w:tcPr>
+          <w:p>
+            <w:r/>
+            <w:r>
+              <w:t>POST /vendor/listings</w:t>
+            </w:r>
+          </w:p>
+        </w:tc>
+        <w:tc>
+          <w:tcPr>
+            <w:tcW w:type="dxa" w:w="2160"/>
+          </w:tcPr>
+          <w:p>
+            <w:r/>
+            <w:r>
+              <w:t>ListingCreate: {category_id, title, description, listing_type, price, unit, quantity_available, region}</w:t>
+            </w:r>
+          </w:p>
+        </w:tc>
+        <w:tc>
+          <w:tcPr>
+            <w:tcW w:type="dxa" w:w="2160"/>
+          </w:tcPr>
+          <w:p>
+            <w:r/>
+            <w:r>
+              <w:t>ListingResponse</w:t>
+            </w:r>
+          </w:p>
+        </w:tc>
+        <w:tc>
+          <w:tcPr>
+            <w:tcW w:type="dxa" w:w="2160"/>
+          </w:tcPr>
+          <w:p>
+            <w:r/>
+            <w:r>
+              <w:t>Creates a DRAFT. 422 if price &lt; 0 or category_id is unknown/inactive.</w:t>
+            </w:r>
+          </w:p>
+        </w:tc>
+      </w:tr>
+      <w:tr>
+        <w:tc>
+          <w:tcPr>
+            <w:tcW w:type="dxa" w:w="2160"/>
+          </w:tcPr>
+          <w:p>
+            <w:r/>
+            <w:r>
+              <w:t>GET /vendor/listings/{id}</w:t>
+            </w:r>
+          </w:p>
+        </w:tc>
+        <w:tc>
+          <w:tcPr>
+            <w:tcW w:type="dxa" w:w="2160"/>
+          </w:tcPr>
+          <w:p>
+            <w:r/>
+            <w:r>
+              <w:t>—</w:t>
+            </w:r>
+          </w:p>
+        </w:tc>
+        <w:tc>
+          <w:tcPr>
+            <w:tcW w:type="dxa" w:w="2160"/>
+          </w:tcPr>
+          <w:p>
+            <w:r/>
+            <w:r>
+              <w:t>ListingResponse</w:t>
+            </w:r>
+          </w:p>
+        </w:tc>
+        <w:tc>
+          <w:tcPr>
+            <w:tcW w:type="dxa" w:w="2160"/>
+          </w:tcPr>
+          <w:p>
+            <w:r/>
+            <w:r>
+              <w:t>404 if not owned by the caller.</w:t>
+            </w:r>
+          </w:p>
+        </w:tc>
+      </w:tr>
+      <w:tr>
+        <w:tc>
+          <w:tcPr>
+            <w:tcW w:type="dxa" w:w="2160"/>
+          </w:tcPr>
+          <w:p>
+            <w:r/>
+            <w:r>
+              <w:t>PUT /vendor/listings/{id}</w:t>
+            </w:r>
+          </w:p>
+        </w:tc>
+        <w:tc>
+          <w:tcPr>
+            <w:tcW w:type="dxa" w:w="2160"/>
+          </w:tcPr>
+          <w:p>
+            <w:r/>
+            <w:r>
+              <w:t>ListingUpdate (same shape as ListingCreate)</w:t>
+            </w:r>
+          </w:p>
+        </w:tc>
+        <w:tc>
+          <w:tcPr>
+            <w:tcW w:type="dxa" w:w="2160"/>
+          </w:tcPr>
+          <w:p>
+            <w:r/>
+            <w:r>
+              <w:t>ListingResponse</w:t>
+            </w:r>
+          </w:p>
+        </w:tc>
+        <w:tc>
+          <w:tcPr>
+            <w:tcW w:type="dxa" w:w="2160"/>
+          </w:tcPr>
+          <w:p>
+            <w:r/>
+            <w:r>
+              <w:t>409 if archived. Resets an active/out_of_stock/rejected listing to pending_review on any real core-field change.</w:t>
+            </w:r>
+          </w:p>
+        </w:tc>
+      </w:tr>
+      <w:tr>
+        <w:tc>
+          <w:tcPr>
+            <w:tcW w:type="dxa" w:w="2160"/>
+          </w:tcPr>
+          <w:p>
+            <w:r/>
+            <w:r>
+              <w:t>DELETE /vendor/listings/{id}</w:t>
+            </w:r>
+          </w:p>
+        </w:tc>
+        <w:tc>
+          <w:tcPr>
+            <w:tcW w:type="dxa" w:w="2160"/>
+          </w:tcPr>
+          <w:p>
+            <w:r/>
+            <w:r>
+              <w:t>—</w:t>
+            </w:r>
+          </w:p>
+        </w:tc>
+        <w:tc>
+          <w:tcPr>
+            <w:tcW w:type="dxa" w:w="2160"/>
+          </w:tcPr>
+          <w:p>
+            <w:r/>
+            <w:r>
+              <w:t>ListingResponse</w:t>
+            </w:r>
+          </w:p>
+        </w:tc>
+        <w:tc>
+          <w:tcPr>
+            <w:tcW w:type="dxa" w:w="2160"/>
+          </w:tcPr>
+          <w:p>
+            <w:r/>
+            <w:r>
+              <w:t>Archives (soft delete) from any status. 409 if already archived.</w:t>
+            </w:r>
+          </w:p>
+        </w:tc>
+      </w:tr>
+      <w:tr>
+        <w:tc>
+          <w:tcPr>
+            <w:tcW w:type="dxa" w:w="2160"/>
+          </w:tcPr>
+          <w:p>
+            <w:r/>
+            <w:r>
+              <w:t>POST /vendor/listings/{id}/images</w:t>
+            </w:r>
+          </w:p>
+        </w:tc>
+        <w:tc>
+          <w:tcPr>
+            <w:tcW w:type="dxa" w:w="2160"/>
+          </w:tcPr>
+          <w:p>
+            <w:r/>
+            <w:r>
+              <w:t>multipart/form-data: file</w:t>
+            </w:r>
+          </w:p>
+        </w:tc>
+        <w:tc>
+          <w:tcPr>
+            <w:tcW w:type="dxa" w:w="2160"/>
+          </w:tcPr>
+          <w:p>
+            <w:r/>
+            <w:r>
+              <w:t>ListingResponse</w:t>
+            </w:r>
+          </w:p>
+        </w:tc>
+        <w:tc>
+          <w:tcPr>
+            <w:tcW w:type="dxa" w:w="2160"/>
+          </w:tcPr>
+          <w:p>
+            <w:r/>
+            <w:r>
+              <w:t>422 on a non-JPEG/PNG/WEBP type or a file over 5 MB. First image auto-becomes primary. Triggers the same pending_review reset as a core-field edit.</w:t>
+            </w:r>
+          </w:p>
+        </w:tc>
+      </w:tr>
+      <w:tr>
+        <w:tc>
+          <w:tcPr>
+            <w:tcW w:type="dxa" w:w="2160"/>
+          </w:tcPr>
+          <w:p>
+            <w:r/>
+            <w:r>
+              <w:t>DELETE /vendor/listings/{id}/images/{image_id}</w:t>
+            </w:r>
+          </w:p>
+        </w:tc>
+        <w:tc>
+          <w:tcPr>
+            <w:tcW w:type="dxa" w:w="2160"/>
+          </w:tcPr>
+          <w:p>
+            <w:r/>
+            <w:r>
+              <w:t>—</w:t>
+            </w:r>
+          </w:p>
+        </w:tc>
+        <w:tc>
+          <w:tcPr>
+            <w:tcW w:type="dxa" w:w="2160"/>
+          </w:tcPr>
+          <w:p>
+            <w:r/>
+            <w:r>
+              <w:t>ListingResponse</w:t>
+            </w:r>
+          </w:p>
+        </w:tc>
+        <w:tc>
+          <w:tcPr>
+            <w:tcW w:type="dxa" w:w="2160"/>
+          </w:tcPr>
+          <w:p>
+            <w:r/>
+            <w:r>
+              <w:t>Best-effort disk delete; promotes the next image to primary if the deleted one was primary.</w:t>
+            </w:r>
+          </w:p>
+        </w:tc>
+      </w:tr>
+      <w:tr>
+        <w:tc>
+          <w:tcPr>
+            <w:tcW w:type="dxa" w:w="2160"/>
+          </w:tcPr>
+          <w:p>
+            <w:r/>
+            <w:r>
+              <w:t>POST /vendor/listings/{id}/submit</w:t>
+            </w:r>
+          </w:p>
+        </w:tc>
+        <w:tc>
+          <w:tcPr>
+            <w:tcW w:type="dxa" w:w="2160"/>
+          </w:tcPr>
+          <w:p>
+            <w:r/>
+            <w:r>
+              <w:t>—</w:t>
+            </w:r>
+          </w:p>
+        </w:tc>
+        <w:tc>
+          <w:tcPr>
+            <w:tcW w:type="dxa" w:w="2160"/>
+          </w:tcPr>
+          <w:p>
+            <w:r/>
+            <w:r>
+              <w:t>ListingResponse</w:t>
+            </w:r>
+          </w:p>
+        </w:tc>
+        <w:tc>
+          <w:tcPr>
+            <w:tcW w:type="dxa" w:w="2160"/>
+          </w:tcPr>
+          <w:p>
+            <w:r/>
+            <w:r>
+              <w:t>draft/rejected → pending_review. 409 otherwise. 422 if price &lt; 0 or zero images.</w:t>
+            </w:r>
+          </w:p>
+        </w:tc>
+      </w:tr>
+      <w:tr>
+        <w:tc>
+          <w:tcPr>
+            <w:tcW w:type="dxa" w:w="2160"/>
+          </w:tcPr>
+          <w:p>
+            <w:r/>
+            <w:r>
+              <w:t>POST /vendor/listings/{id}/status</w:t>
+            </w:r>
+          </w:p>
+        </w:tc>
+        <w:tc>
+          <w:tcPr>
+            <w:tcW w:type="dxa" w:w="2160"/>
+          </w:tcPr>
+          <w:p>
+            <w:r/>
+            <w:r>
+              <w:t>ListingStatusToggleRequest: {status: active|out_of_stock}</w:t>
+            </w:r>
+          </w:p>
+        </w:tc>
+        <w:tc>
+          <w:tcPr>
+            <w:tcW w:type="dxa" w:w="2160"/>
+          </w:tcPr>
+          <w:p>
+            <w:r/>
+            <w:r>
+              <w:t>ListingResponse</w:t>
+            </w:r>
+          </w:p>
+        </w:tc>
+        <w:tc>
+          <w:tcPr>
+            <w:tcW w:type="dxa" w:w="2160"/>
+          </w:tcPr>
+          <w:p>
+            <w:r/>
+            <w:r>
+              <w:t>409 unless the listing is currently active or out_of_stock. Does NOT trigger re-review (Emmanuel's decision, 10 Sep 2026).</w:t>
+            </w:r>
+          </w:p>
+        </w:tc>
+      </w:tr>
+      <w:tr>
+        <w:tc>
+          <w:tcPr>
+            <w:tcW w:type="dxa" w:w="2160"/>
+          </w:tcPr>
+          <w:p>
+            <w:r/>
+            <w:r>
+              <w:t>GET /vendor/notifications</w:t>
+            </w:r>
+          </w:p>
+        </w:tc>
+        <w:tc>
+          <w:tcPr>
+            <w:tcW w:type="dxa" w:w="2160"/>
+          </w:tcPr>
+          <w:p>
+            <w:r/>
+            <w:r>
+              <w:t>—</w:t>
+            </w:r>
+          </w:p>
+        </w:tc>
+        <w:tc>
+          <w:tcPr>
+            <w:tcW w:type="dxa" w:w="2160"/>
+          </w:tcPr>
+          <w:p>
+            <w:r/>
+            <w:r>
+              <w:t>List[NotificationResponse]</w:t>
+            </w:r>
+          </w:p>
+        </w:tc>
+        <w:tc>
+          <w:tcPr>
+            <w:tcW w:type="dxa" w:w="2160"/>
+          </w:tcPr>
+          <w:p>
+            <w:r/>
+            <w:r>
+              <w:t>Newest first. Real in-app rows, not simulated — created by admin approve/reject below.</w:t>
+            </w:r>
+          </w:p>
+        </w:tc>
+      </w:tr>
+      <w:tr>
+        <w:tc>
+          <w:tcPr>
+            <w:tcW w:type="dxa" w:w="2160"/>
+          </w:tcPr>
+          <w:p>
+            <w:r/>
+            <w:r>
+              <w:t>POST /vendor/notifications/{id}/read</w:t>
+            </w:r>
+          </w:p>
+        </w:tc>
+        <w:tc>
+          <w:tcPr>
+            <w:tcW w:type="dxa" w:w="2160"/>
+          </w:tcPr>
+          <w:p>
+            <w:r/>
+            <w:r>
+              <w:t>—</w:t>
+            </w:r>
+          </w:p>
+        </w:tc>
+        <w:tc>
+          <w:tcPr>
+            <w:tcW w:type="dxa" w:w="2160"/>
+          </w:tcPr>
+          <w:p>
+            <w:r/>
+            <w:r>
+              <w:t>NotificationResponse</w:t>
+            </w:r>
+          </w:p>
+        </w:tc>
+        <w:tc>
+          <w:tcPr>
+            <w:tcW w:type="dxa" w:w="2160"/>
+          </w:tcPr>
+          <w:p>
+            <w:r/>
+            <w:r>
+              <w:t>Idempotent — a second call on an already-read notification is a no-op, not an error.</w:t>
+            </w:r>
+          </w:p>
+        </w:tc>
+      </w:tr>
+    </w:tbl>
+    <w:p>
+      <w:pPr>
+        <w:pStyle w:val="Heading1"/>
+      </w:pPr>
+      <w:r>
+        <w:t>18. Vendor Listing Approval Endpoints (role: super_admin only)</w:t>
+      </w:r>
+    </w:p>
+    <w:p>
+      <w:pPr/>
+      <w:r>
+        <w:t>The admin side of Section 17's workflow — scoped to Super Admin only, the same precedent as Registration Approval (Section 5); 403 for every other role including the two Internal Ops Staff roles. Both approve and reject write a real Audit Log entry (listing_approved / listing_rejected) and create a real Notification row for the vendor.</w:t>
+      </w:r>
+    </w:p>
+    <w:tbl>
+      <w:tblPr>
+        <w:tblW w:type="auto" w:w="0"/>
+        <w:tblLook w:firstColumn="1" w:firstRow="1" w:lastColumn="0" w:lastRow="0" w:noHBand="0" w:noVBand="1" w:val="04A0"/>
+        <w:tblBorders>
+          <w:top w:val="single" w:color="auto" w:sz="4"/>
+          <w:left w:val="single" w:color="auto" w:sz="4"/>
+          <w:bottom w:val="single" w:color="auto" w:sz="4"/>
+          <w:right w:val="single" w:color="auto" w:sz="4"/>
+          <w:insideH w:val="single" w:color="auto" w:sz="4"/>
+          <w:insideV w:val="single" w:color="auto" w:sz="4"/>
+        </w:tblBorders>
+      </w:tblPr>
+      <w:tblGrid>
+        <w:gridCol w:w="2160"/>
+        <w:gridCol w:w="2160"/>
+        <w:gridCol w:w="2160"/>
+        <w:gridCol w:w="2160"/>
+      </w:tblGrid>
+      <w:tr>
+        <w:tc>
+          <w:tcPr>
+            <w:tcW w:type="dxa" w:w="2160"/>
+          </w:tcPr>
+          <w:p>
+            <w:r/>
+            <w:r>
+              <w:rPr>
+                <w:b/>
+              </w:rPr>
+              <w:t>Method &amp; path</w:t>
+            </w:r>
+          </w:p>
+        </w:tc>
+        <w:tc>
+          <w:tcPr>
+            <w:tcW w:type="dxa" w:w="2160"/>
+          </w:tcPr>
+          <w:p>
+            <w:r/>
+            <w:r>
+              <w:rPr>
+                <w:b/>
+              </w:rPr>
+              <w:t>Request body</w:t>
+            </w:r>
+          </w:p>
+        </w:tc>
+        <w:tc>
+          <w:tcPr>
+            <w:tcW w:type="dxa" w:w="2160"/>
+          </w:tcPr>
+          <w:p>
+            <w:r/>
+            <w:r>
+              <w:rPr>
+                <w:b/>
+              </w:rPr>
+              <w:t>Response</w:t>
+            </w:r>
+          </w:p>
+        </w:tc>
+        <w:tc>
+          <w:tcPr>
+            <w:tcW w:type="dxa" w:w="2160"/>
+          </w:tcPr>
+          <w:p>
+            <w:r/>
+            <w:r>
+              <w:rPr>
+                <w:b/>
+              </w:rPr>
+              <w:t>Notes</w:t>
+            </w:r>
+          </w:p>
+        </w:tc>
+      </w:tr>
+      <w:tr>
+        <w:tc>
+          <w:tcPr>
+            <w:tcW w:type="dxa" w:w="2160"/>
+          </w:tcPr>
+          <w:p>
+            <w:r/>
+            <w:r>
+              <w:t>GET /admin/listings/pending</w:t>
+            </w:r>
+          </w:p>
+        </w:tc>
+        <w:tc>
+          <w:tcPr>
+            <w:tcW w:type="dxa" w:w="2160"/>
+          </w:tcPr>
+          <w:p>
+            <w:r/>
+            <w:r>
+              <w:t>—</w:t>
+            </w:r>
+          </w:p>
+        </w:tc>
+        <w:tc>
+          <w:tcPr>
+            <w:tcW w:type="dxa" w:w="2160"/>
+          </w:tcPr>
+          <w:p>
+            <w:r/>
+            <w:r>
+              <w:t>List[ListingResponse]</w:t>
+            </w:r>
+          </w:p>
+        </w:tc>
+        <w:tc>
+          <w:tcPr>
+            <w:tcW w:type="dxa" w:w="2160"/>
+          </w:tcPr>
+          <w:p>
+            <w:r/>
+            <w:r>
+              <w:t>Every listing at pending_review, oldest-updated first.</w:t>
+            </w:r>
+          </w:p>
+        </w:tc>
+      </w:tr>
+      <w:tr>
+        <w:tc>
+          <w:tcPr>
+            <w:tcW w:type="dxa" w:w="2160"/>
+          </w:tcPr>
+          <w:p>
+            <w:r/>
+            <w:r>
+              <w:t>POST /admin/listings/{id}/approve</w:t>
+            </w:r>
+          </w:p>
+        </w:tc>
+        <w:tc>
+          <w:tcPr>
+            <w:tcW w:type="dxa" w:w="2160"/>
+          </w:tcPr>
+          <w:p>
+            <w:r/>
+            <w:r>
+              <w:t>—</w:t>
+            </w:r>
+          </w:p>
+        </w:tc>
+        <w:tc>
+          <w:tcPr>
+            <w:tcW w:type="dxa" w:w="2160"/>
+          </w:tcPr>
+          <w:p>
+            <w:r/>
+            <w:r>
+              <w:t>ListingResponse</w:t>
+            </w:r>
+          </w:p>
+        </w:tc>
+        <w:tc>
+          <w:tcPr>
+            <w:tcW w:type="dxa" w:w="2160"/>
+          </w:tcPr>
+          <w:p>
+            <w:r/>
+            <w:r>
+              <w:t>pending_review → active. Stamps reviewed_by/reviewed_at. 409 if not pending_review.</w:t>
+            </w:r>
+          </w:p>
+        </w:tc>
+      </w:tr>
+      <w:tr>
+        <w:tc>
+          <w:tcPr>
+            <w:tcW w:type="dxa" w:w="2160"/>
+          </w:tcPr>
+          <w:p>
+            <w:r/>
+            <w:r>
+              <w:t>POST /admin/listings/{id}/reject</w:t>
+            </w:r>
+          </w:p>
+        </w:tc>
+        <w:tc>
+          <w:tcPr>
+            <w:tcW w:type="dxa" w:w="2160"/>
+          </w:tcPr>
+          <w:p>
+            <w:r/>
+            <w:r>
+              <w:t>ListingRejectRequest: {rejection_reason}</w:t>
+            </w:r>
+          </w:p>
+        </w:tc>
+        <w:tc>
+          <w:tcPr>
+            <w:tcW w:type="dxa" w:w="2160"/>
+          </w:tcPr>
+          <w:p>
+            <w:r/>
+            <w:r>
+              <w:t>ListingResponse</w:t>
+            </w:r>
+          </w:p>
+        </w:tc>
+        <w:tc>
+          <w:tcPr>
+            <w:tcW w:type="dxa" w:w="2160"/>
+          </w:tcPr>
+          <w:p>
+            <w:r/>
+            <w:r>
+              <w:t>pending_review → rejected. 422 if rejection_reason is blank. 409 if not pending_review.</w:t>
+            </w:r>
+          </w:p>
+        </w:tc>
+      </w:tr>
+      <w:tr>
+        <w:tc>
+          <w:tcPr>
+            <w:tcW w:type="dxa" w:w="2160"/>
+          </w:tcPr>
+          <w:p>
+            <w:r/>
+            <w:r>
+              <w:t>GET /admin/listing-categories</w:t>
+            </w:r>
+          </w:p>
+        </w:tc>
+        <w:tc>
+          <w:tcPr>
+            <w:tcW w:type="dxa" w:w="2160"/>
+          </w:tcPr>
+          <w:p>
+            <w:r/>
+            <w:r>
+              <w:t>—</w:t>
+            </w:r>
+          </w:p>
+        </w:tc>
+        <w:tc>
+          <w:tcPr>
+            <w:tcW w:type="dxa" w:w="2160"/>
+          </w:tcPr>
+          <w:p>
+            <w:r/>
+            <w:r>
+              <w:t>List[ListingCategoryResponse]</w:t>
+            </w:r>
+          </w:p>
+        </w:tc>
+        <w:tc>
+          <w:tcPr>
+            <w:tcW w:type="dxa" w:w="2160"/>
+          </w:tcPr>
+          <w:p>
+            <w:r/>
+            <w:r>
+              <w:t>Includes inactive categories (unlike the public/vendor-facing GET /listings/categories).</w:t>
+            </w:r>
+          </w:p>
+        </w:tc>
+      </w:tr>
+      <w:tr>
+        <w:tc>
+          <w:tcPr>
+            <w:tcW w:type="dxa" w:w="2160"/>
+          </w:tcPr>
+          <w:p>
+            <w:r/>
+            <w:r>
+              <w:t>POST /admin/listing-categories</w:t>
+            </w:r>
+          </w:p>
+        </w:tc>
+        <w:tc>
+          <w:tcPr>
+            <w:tcW w:type="dxa" w:w="2160"/>
+          </w:tcPr>
+          <w:p>
+            <w:r/>
+            <w:r>
+              <w:t>ListingCategoryCreate: {name}</w:t>
+            </w:r>
+          </w:p>
+        </w:tc>
+        <w:tc>
+          <w:tcPr>
+            <w:tcW w:type="dxa" w:w="2160"/>
+          </w:tcPr>
+          <w:p>
+            <w:r/>
+            <w:r>
+              <w:t>ListingCategoryResponse</w:t>
+            </w:r>
+          </w:p>
+        </w:tc>
+        <w:tc>
+          <w:tcPr>
+            <w:tcW w:type="dxa" w:w="2160"/>
+          </w:tcPr>
+          <w:p>
+            <w:r/>
+            <w:r>
+              <w:t>409 on a duplicate slug (derived from name).</w:t>
+            </w:r>
+          </w:p>
+        </w:tc>
+      </w:tr>
+      <w:tr>
+        <w:tc>
+          <w:tcPr>
+            <w:tcW w:type="dxa" w:w="2160"/>
+          </w:tcPr>
+          <w:p>
+            <w:r/>
+            <w:r>
+              <w:t>POST /admin/listing-categories/{id}/deactivate</w:t>
+            </w:r>
+          </w:p>
+        </w:tc>
+        <w:tc>
+          <w:tcPr>
+            <w:tcW w:type="dxa" w:w="2160"/>
+          </w:tcPr>
+          <w:p>
+            <w:r/>
+            <w:r>
+              <w:t>—</w:t>
+            </w:r>
+          </w:p>
+        </w:tc>
+        <w:tc>
+          <w:tcPr>
+            <w:tcW w:type="dxa" w:w="2160"/>
+          </w:tcPr>
+          <w:p>
+            <w:r/>
+            <w:r>
+              <w:t>ListingCategoryResponse</w:t>
+            </w:r>
+          </w:p>
+        </w:tc>
+        <w:tc>
+          <w:tcPr>
+            <w:tcW w:type="dxa" w:w="2160"/>
+          </w:tcPr>
+          <w:p>
+            <w:r/>
+            <w:r>
+              <w:t>Soft-disable — existing listings referencing it are unaffected.</w:t>
+            </w:r>
+          </w:p>
+        </w:tc>
+      </w:tr>
+    </w:tbl>
+    <w:p>
+      <w:pPr>
+        <w:pStyle w:val="Heading1"/>
+      </w:pPr>
+      <w:r>
+        <w:t>19. Farmer/Buyer Listing Browse Endpoints (roles: farmer, buyer)</w:t>
+      </w:r>
+    </w:p>
+    <w:p>
+      <w:pPr/>
+      <w:r>
+        <w:t>Read-only browse/search over active listings only — draft/pending/rejected/out_of_stock/archived rows never appear here regardless of filters. No caching of any kind: every call queries the database directly, so an admin approval/rejection or a vendor's own status change is reflected on the very next call. GET /listings/categories is also open to Vendor, for the Add New Listing category picker.</w:t>
+      </w:r>
+    </w:p>
+    <w:tbl>
+      <w:tblPr>
+        <w:tblW w:type="auto" w:w="0"/>
+        <w:tblLook w:firstColumn="1" w:firstRow="1" w:lastColumn="0" w:lastRow="0" w:noHBand="0" w:noVBand="1" w:val="04A0"/>
+        <w:tblBorders>
+          <w:top w:val="single" w:color="auto" w:sz="4"/>
+          <w:left w:val="single" w:color="auto" w:sz="4"/>
+          <w:bottom w:val="single" w:color="auto" w:sz="4"/>
+          <w:right w:val="single" w:color="auto" w:sz="4"/>
+          <w:insideH w:val="single" w:color="auto" w:sz="4"/>
+          <w:insideV w:val="single" w:color="auto" w:sz="4"/>
+        </w:tblBorders>
+      </w:tblPr>
+      <w:tblGrid>
+        <w:gridCol w:w="2160"/>
+        <w:gridCol w:w="2160"/>
+        <w:gridCol w:w="2160"/>
+        <w:gridCol w:w="2160"/>
+      </w:tblGrid>
+      <w:tr>
+        <w:tc>
+          <w:tcPr>
+            <w:tcW w:type="dxa" w:w="2160"/>
+          </w:tcPr>
+          <w:p>
+            <w:r/>
+            <w:r>
+              <w:rPr>
+                <w:b/>
+              </w:rPr>
+              <w:t>Method &amp; path</w:t>
+            </w:r>
+          </w:p>
+        </w:tc>
+        <w:tc>
+          <w:tcPr>
+            <w:tcW w:type="dxa" w:w="2160"/>
+          </w:tcPr>
+          <w:p>
+            <w:r/>
+            <w:r>
+              <w:rPr>
+                <w:b/>
+              </w:rPr>
+              <w:t>Request body</w:t>
+            </w:r>
+          </w:p>
+        </w:tc>
+        <w:tc>
+          <w:tcPr>
+            <w:tcW w:type="dxa" w:w="2160"/>
+          </w:tcPr>
+          <w:p>
+            <w:r/>
+            <w:r>
+              <w:rPr>
+                <w:b/>
+              </w:rPr>
+              <w:t>Response</w:t>
+            </w:r>
+          </w:p>
+        </w:tc>
+        <w:tc>
+          <w:tcPr>
+            <w:tcW w:type="dxa" w:w="2160"/>
+          </w:tcPr>
+          <w:p>
+            <w:r/>
+            <w:r>
+              <w:rPr>
+                <w:b/>
+              </w:rPr>
+              <w:t>Notes</w:t>
+            </w:r>
+          </w:p>
+        </w:tc>
+      </w:tr>
+      <w:tr>
+        <w:tc>
+          <w:tcPr>
+            <w:tcW w:type="dxa" w:w="2160"/>
+          </w:tcPr>
+          <w:p>
+            <w:r/>
+            <w:r>
+              <w:t>GET /listings/categories</w:t>
+            </w:r>
+          </w:p>
+        </w:tc>
+        <w:tc>
+          <w:tcPr>
+            <w:tcW w:type="dxa" w:w="2160"/>
+          </w:tcPr>
+          <w:p>
+            <w:r/>
+            <w:r>
+              <w:t>—</w:t>
+            </w:r>
+          </w:p>
+        </w:tc>
+        <w:tc>
+          <w:tcPr>
+            <w:tcW w:type="dxa" w:w="2160"/>
+          </w:tcPr>
+          <w:p>
+            <w:r/>
+            <w:r>
+              <w:t>List[ListingCategoryResponse]</w:t>
+            </w:r>
+          </w:p>
+        </w:tc>
+        <w:tc>
+          <w:tcPr>
+            <w:tcW w:type="dxa" w:w="2160"/>
+          </w:tcPr>
+          <w:p>
+            <w:r/>
+            <w:r>
+              <w:t>Active categories only. Vendor/Farmer/Buyer.</w:t>
+            </w:r>
+          </w:p>
+        </w:tc>
+      </w:tr>
+      <w:tr>
+        <w:tc>
+          <w:tcPr>
+            <w:tcW w:type="dxa" w:w="2160"/>
+          </w:tcPr>
+          <w:p>
+            <w:r/>
+            <w:r>
+              <w:t>GET /listings</w:t>
+            </w:r>
+          </w:p>
+        </w:tc>
+        <w:tc>
+          <w:tcPr>
+            <w:tcW w:type="dxa" w:w="2160"/>
+          </w:tcPr>
+          <w:p>
+            <w:r/>
+            <w:r>
+              <w:t>— (optional ?category_id&amp;region&amp;vendor_id&amp;min_price&amp;max_price&amp;q query params)</w:t>
+            </w:r>
+          </w:p>
+        </w:tc>
+        <w:tc>
+          <w:tcPr>
+            <w:tcW w:type="dxa" w:w="2160"/>
+          </w:tcPr>
+          <w:p>
+            <w:r/>
+            <w:r>
+              <w:t>List[ListingResponse]</w:t>
+            </w:r>
+          </w:p>
+        </w:tc>
+        <w:tc>
+          <w:tcPr>
+            <w:tcW w:type="dxa" w:w="2160"/>
+          </w:tcPr>
+          <w:p>
+            <w:r/>
+            <w:r>
+              <w:t>q searches title + description, case-insensitive. Farmer/Buyer only — 403 for a vendor token.</w:t>
+            </w:r>
+          </w:p>
+        </w:tc>
+      </w:tr>
+      <w:tr>
+        <w:tc>
+          <w:tcPr>
+            <w:tcW w:type="dxa" w:w="2160"/>
+          </w:tcPr>
+          <w:p>
+            <w:r/>
+            <w:r>
+              <w:t>GET /listings/{id}</w:t>
+            </w:r>
+          </w:p>
+        </w:tc>
+        <w:tc>
+          <w:tcPr>
+            <w:tcW w:type="dxa" w:w="2160"/>
+          </w:tcPr>
+          <w:p>
+            <w:r/>
+            <w:r>
+              <w:t>—</w:t>
+            </w:r>
+          </w:p>
+        </w:tc>
+        <w:tc>
+          <w:tcPr>
+            <w:tcW w:type="dxa" w:w="2160"/>
+          </w:tcPr>
+          <w:p>
+            <w:r/>
+            <w:r>
+              <w:t>ListingResponse</w:t>
+            </w:r>
+          </w:p>
+        </w:tc>
+        <w:tc>
+          <w:tcPr>
+            <w:tcW w:type="dxa" w:w="2160"/>
+          </w:tcPr>
+          <w:p>
+            <w:r/>
+            <w:r>
+              <w:t>404 unless the listing is active.</w:t>
+            </w:r>
+          </w:p>
+        </w:tc>
+      </w:tr>
+    </w:tbl>
     <w:sectPr>
       <w:pgSz w:w="12240" w:h="15840"/>
       <w:pgMar w:top="1440" w:right="1800" w:bottom="1440" w:left="1800" w:header="720" w:footer="720" w:gutter="0"/>

</xml_diff>